<commit_message>
hardware: 量産構成をRaspberry Pi CM4で確定
CM4(WiFi/eMMC/2GB)をキャリア基板に実装。GbE→背面RJ-45、USB2.0→XU316直結、
+5V。WiFiはCM4内蔵無線+u.FL→RF窓内蔵アンテナ(USB子機は廃止)。CM4は省電力で
筐体導熱しやすく冷却にも有利。BOM/仕様書/構成図を全面的にCM4へ更新。
残: CM4キャリア詳細回路図・確定BOM・機構・EMC/安全規格。

Co-Authored-By: Claude Opus 4.8 <noreply@anthropic.com>
</commit_message>
<xml_diff>
--- a/hardware/製品仕様書_SRT音声コーデック.docx
+++ b/hardware/製品仕様書_SRT音声コーデック.docx
@@ -152,7 +152,7 @@
           <w:sz w:val="21"/>
           <w:szCs w:val="21"/>
         </w:rPr>
-        <w:t xml:space="preserve">本製品は、バランスアナログおよびAES/EBUの音声を、SRT（Secure Reliable Transport）で一般IP回線（フレッツ光・VPN・専用線・インターネット等）を通じて双方向伝送する、1UラックマウントのIP音声コーデックである。USBオーディオ・フロントエンド（UAC2準拠）とRaspberry Pi 4を内蔵し、1台で送受信が完結する。コーデックの切り替え・遅延設定はスマートフォンのブラウザから行える。</w:t>
+        <w:t xml:space="preserve">本製品は、バランスアナログおよびAES/EBUの音声を、SRT（Secure Reliable Transport）で一般IP回線（フレッツ光・VPN・専用線・インターネット等）を通じて双方向伝送する、1UラックマウントのIP音声コーデックである。USBオーディオ・フロントエンド（UAC2準拠）とRaspberry Pi CM4を内蔵し、1台で送受信が完結する。コーデックの切り替え・遅延設定はスマートフォンのブラウザから行える。</w:t>
       </w:r>
     </w:p>
     <w:p>
@@ -275,7 +275,7 @@
           <w:sz w:val="21"/>
           <w:szCs w:val="21"/>
         </w:rPr>
-        <w:t xml:space="preserve">Raspberry Pi 4 内蔵・1U完結。LAN／Wi-Fi対応</w:t>
+        <w:t xml:space="preserve">Raspberry Pi CM4 内蔵・1U完結。GbE LAN／Wi-Fi対応</w:t>
       </w:r>
     </w:p>
     <w:p>
@@ -867,7 +867,7 @@
                 <w:sz w:val="18"/>
                 <w:szCs w:val="18"/>
               </w:rPr>
-              <w:t xml:space="preserve">RJ-45 10/100/1000。SRT伝送＋WEB操作</w:t>
+              <w:t xml:space="preserve">RJ-45 GbE（CM4）。SRT伝送＋WEB操作</w:t>
             </w:r>
           </w:p>
         </w:tc>
@@ -1203,7 +1203,7 @@
                 <w:sz w:val="18"/>
                 <w:szCs w:val="18"/>
               </w:rPr>
-              <w:t xml:space="preserve">樹脂カバー（レドーム）内側に内蔵アンテナ。スマホからの操作用（外付けUSB無線子機）</w:t>
+              <w:t xml:space="preserve">樹脂カバー（レドーム）内側に内蔵アンテナ（CM4内蔵無線＋u.FL）。スマホからの操作用</w:t>
             </w:r>
           </w:p>
         </w:tc>
@@ -2709,7 +2709,7 @@
           <w:sz w:val="21"/>
           <w:szCs w:val="21"/>
         </w:rPr>
-        <w:t xml:space="preserve">Wi-Fi：外付けUSB無線子機＋パネルRF窓（樹脂カバー）内蔵アンテナ経由。スマートフォンからコーデック切替・状態確認（codec_web）</w:t>
+        <w:t xml:space="preserve">Wi-Fi：CM4内蔵無線＋u.FL→パネルRF窓（樹脂カバー）内蔵アンテナ経由。スマートフォンからコーデック切替・状態確認（codec_web）</w:t>
       </w:r>
     </w:p>
     <w:p>
@@ -3112,7 +3112,7 @@
                 <w:sz w:val="18"/>
                 <w:szCs w:val="18"/>
               </w:rPr>
-              <w:t xml:space="preserve">Raspberry Pi 4（2GB。量産時はCM4を検討）</w:t>
+              <w:t xml:space="preserve">Raspberry Pi CM4（WiFi/eMMC/2GB、キャリア基板に実装。試作はPi4B可）</w:t>
             </w:r>
           </w:p>
         </w:tc>
@@ -3168,7 +3168,7 @@
                 <w:sz w:val="18"/>
                 <w:szCs w:val="18"/>
               </w:rPr>
-              <w:t xml:space="preserve">外付けUSB無線子機（技適済）＋パネルRF窓（樹脂カバー）内蔵アンテナ</w:t>
+              <w:t xml:space="preserve">CM4内蔵無線＋u.FL→パネルRF窓（樹脂カバー）内蔵アンテナ</w:t>
             </w:r>
           </w:p>
         </w:tc>
@@ -3693,7 +3693,7 @@
           <w:sz w:val="21"/>
           <w:szCs w:val="21"/>
         </w:rPr>
-        <w:t xml:space="preserve">量産構成（Raspberry Pi 4 ボード or CM4化）</w:t>
+        <w:t xml:space="preserve">CM4キャリア詳細回路図・確定BOM（型番/員数）</w:t>
       </w:r>
     </w:p>
     <w:p>
@@ -3711,7 +3711,7 @@
           <w:sz w:val="21"/>
           <w:szCs w:val="21"/>
         </w:rPr>
-        <w:t xml:space="preserve">確定BOM・詳細回路図・質量・EMC/安全規格対応</w:t>
+        <w:t xml:space="preserve">機構（1U筐体・パネル・RF窓）・質量・EMC/安全規格対応</w:t>
       </w:r>
     </w:p>
     <w:p>

</xml_diff>